<commit_message>
fix(cicd): deploy acrescenta commit na branch producao em vez de --force
Cada deploy vira um commit com dois pais (deploy anterior + commit da main
publicado), gravado com push normal; concurrency coloca deploys simultâneos
em fila. git log --first-parent origin/producao passa a ser o histórico de
deploys, inclusive rollbacks. Docs e STATUS atualizados (deploys #47/#48).

Co-Authored-By: Claude Opus 5.5 <noreply@anthropic.com>
</commit_message>
<xml_diff>
--- a/docs/K8S_FLUXO_DEV_CICD.docx
+++ b/docs/K8S_FLUXO_DEV_CICD.docx
@@ -3457,21 +3457,52 @@
         <w:t xml:space="preserve"> </w:t>
       </w:r>
       <w:r>
-        <w:t xml:space="preserve">e o seu usuário, e faz push na branch</w:t>
-      </w:r>
-      <w:r>
-        <w:t xml:space="preserve"> </w:t>
-      </w:r>
-      <w:r>
-        <w:rPr>
-          <w:rStyle w:val="VerbatimChar"/>
+        <w:t xml:space="preserve">e o seu usuário, e acrescenta</w:t>
+      </w:r>
+      <w:r>
+        <w:t xml:space="preserve"> </w:t>
+      </w:r>
+      <w:r>
+        <w:rPr>
           <w:b/>
           <w:bCs/>
         </w:rPr>
+        <w:t xml:space="preserve">um commit de deploy</w:t>
+      </w:r>
+      <w:r>
+        <w:t xml:space="preserve"> </w:t>
+      </w:r>
+      <w:r>
+        <w:t xml:space="preserve">na branch</w:t>
+      </w:r>
+      <w:r>
+        <w:t xml:space="preserve"> </w:t>
+      </w:r>
+      <w:r>
+        <w:rPr>
+          <w:rStyle w:val="VerbatimChar"/>
+          <w:b/>
+          <w:bCs/>
+        </w:rPr>
         <w:t xml:space="preserve">producao</w:t>
       </w:r>
       <w:r>
-        <w:t xml:space="preserve">. O resumo do run mostra a versão gravada.</w:t>
+        <w:t xml:space="preserve"> </w:t>
+      </w:r>
+      <w:r>
+        <w:t xml:space="preserve">(push normal, sem</w:t>
+      </w:r>
+      <w:r>
+        <w:t xml:space="preserve"> </w:t>
+      </w:r>
+      <w:r>
+        <w:rPr>
+          <w:rStyle w:val="VerbatimChar"/>
+        </w:rPr>
+        <w:t xml:space="preserve">--force</w:t>
+      </w:r>
+      <w:r>
+        <w:t xml:space="preserve">). O resumo do run mostra a versão gravada.</w:t>
       </w:r>
     </w:p>
     <w:p>
@@ -3710,7 +3741,7 @@
         <w:t xml:space="preserve"> </w:t>
       </w:r>
       <w:r>
-        <w:t xml:space="preserve">o que roda em produção é exatamente o que está na branch</w:t>
+        <w:t xml:space="preserve">o que roda em produção é exatamente o que está na ponta da branch</w:t>
       </w:r>
       <w:r>
         <w:t xml:space="preserve"> </w:t>
@@ -3722,22 +3753,164 @@
         <w:t xml:space="preserve">producao</w:t>
       </w:r>
       <w:r>
-        <w:t xml:space="preserve">.</w:t>
-      </w:r>
-      <w:r>
-        <w:t xml:space="preserve"> </w:t>
-      </w:r>
-      <w:r>
-        <w:rPr>
-          <w:rStyle w:val="VerbatimChar"/>
-        </w:rPr>
-        <w:t xml:space="preserve">git log origin/producao</w:t>
-      </w:r>
-      <w:r>
-        <w:t xml:space="preserve"> </w:t>
-      </w:r>
-      <w:r>
-        <w:t xml:space="preserve">é o histórico de deploys (quem, quando, qual versão).</w:t>
+        <w:t xml:space="preserve">. E a branch inteira é o</w:t>
+      </w:r>
+      <w:r>
+        <w:t xml:space="preserve"> </w:t>
+      </w:r>
+      <w:r>
+        <w:rPr>
+          <w:b/>
+          <w:bCs/>
+        </w:rPr>
+        <w:t xml:space="preserve">histórico de deploys</w:t>
+      </w:r>
+      <w:r>
+        <w:t xml:space="preserve">: cada deploy é um commit novo em cima do anterior, com dois pais — o deploy anterior e o commit da</w:t>
+      </w:r>
+      <w:r>
+        <w:t xml:space="preserve"> </w:t>
+      </w:r>
+      <w:r>
+        <w:rPr>
+          <w:rStyle w:val="VerbatimChar"/>
+        </w:rPr>
+        <w:t xml:space="preserve">main</w:t>
+      </w:r>
+      <w:r>
+        <w:t xml:space="preserve"> </w:t>
+      </w:r>
+      <w:r>
+        <w:t xml:space="preserve">que foi publicado:</w:t>
+      </w:r>
+    </w:p>
+    <w:p>
+      <w:pPr>
+        <w:pStyle w:val="SourceCode"/>
+        <w:numPr>
+          <w:ilvl w:val="0"/>
+          <w:numId w:val="1000"/>
+        </w:numPr>
+      </w:pPr>
+      <w:r>
+        <w:rPr>
+          <w:rStyle w:val="VerbatimChar"/>
+        </w:rPr>
+        <w:t xml:space="preserve">git fetch &amp;&amp; git log --first-parent --oneline origin/producao</w:t>
+      </w:r>
+      <w:r>
+        <w:br/>
+      </w:r>
+      <w:r>
+        <w:rPr>
+          <w:rStyle w:val="VerbatimChar"/>
+        </w:rPr>
+        <w:t xml:space="preserve">c3d4e5f deploy: produção na versão 0f3d3c7 (… disparado por ScaTecnologia)   ← exemplo: um rollback também vira um deploy</w:t>
+      </w:r>
+      <w:r>
+        <w:br/>
+      </w:r>
+      <w:r>
+        <w:rPr>
+          <w:rStyle w:val="VerbatimChar"/>
+        </w:rPr>
+        <w:t xml:space="preserve">a1b2c3d deploy: produção na versão b6238f2 (… disparado por ScaTecnologia)</w:t>
+      </w:r>
+    </w:p>
+    <w:p>
+      <w:pPr>
+        <w:pStyle w:val="Compact"/>
+        <w:numPr>
+          <w:ilvl w:val="0"/>
+          <w:numId w:val="1000"/>
+        </w:numPr>
+      </w:pPr>
+      <w:r>
+        <w:rPr>
+          <w:rStyle w:val="VerbatimChar"/>
+        </w:rPr>
+        <w:t xml:space="preserve">--first-parent</w:t>
+      </w:r>
+      <w:r>
+        <w:t xml:space="preserve"> </w:t>
+      </w:r>
+      <w:r>
+        <w:t xml:space="preserve">mostra só a fila de deploys; sem ele, o log também desce pelo histórico da</w:t>
+      </w:r>
+      <w:r>
+        <w:t xml:space="preserve"> </w:t>
+      </w:r>
+      <w:r>
+        <w:rPr>
+          <w:rStyle w:val="VerbatimChar"/>
+        </w:rPr>
+        <w:t xml:space="preserve">main</w:t>
+      </w:r>
+      <w:r>
+        <w:t xml:space="preserve">. Dois deploys ao mesmo tempo entram em fila (</w:t>
+      </w:r>
+      <w:r>
+        <w:rPr>
+          <w:rStyle w:val="VerbatimChar"/>
+        </w:rPr>
+        <w:t xml:space="preserve">concurrency</w:t>
+      </w:r>
+      <w:r>
+        <w:t xml:space="preserve">), e se um tentar gravar em cima de uma</w:t>
+      </w:r>
+      <w:r>
+        <w:t xml:space="preserve"> </w:t>
+      </w:r>
+      <w:r>
+        <w:rPr>
+          <w:rStyle w:val="VerbatimChar"/>
+        </w:rPr>
+        <w:t xml:space="preserve">producao</w:t>
+      </w:r>
+      <w:r>
+        <w:t xml:space="preserve"> </w:t>
+      </w:r>
+      <w:r>
+        <w:t xml:space="preserve">desatualizada o Git recusa o push — ninguém apaga o deploy de ninguém.</w:t>
+      </w:r>
+    </w:p>
+    <w:p>
+      <w:pPr>
+        <w:pStyle w:val="BlockText"/>
+        <w:numPr>
+          <w:ilvl w:val="0"/>
+          <w:numId w:val="1000"/>
+        </w:numPr>
+      </w:pPr>
+      <w:r>
+        <w:t xml:space="preserve">Até 2026-10-30 o job usava</w:t>
+      </w:r>
+      <w:r>
+        <w:t xml:space="preserve"> </w:t>
+      </w:r>
+      <w:r>
+        <w:rPr>
+          <w:rStyle w:val="VerbatimChar"/>
+        </w:rPr>
+        <w:t xml:space="preserve">git push --force</w:t>
+      </w:r>
+      <w:r>
+        <w:t xml:space="preserve"> </w:t>
+      </w:r>
+      <w:r>
+        <w:t xml:space="preserve">e cada deploy substituía o anterior; por isso os deploys de antes disso (ex.:</w:t>
+      </w:r>
+      <w:r>
+        <w:t xml:space="preserve"> </w:t>
+      </w:r>
+      <w:r>
+        <w:rPr>
+          <w:rStyle w:val="VerbatimChar"/>
+        </w:rPr>
+        <w:t xml:space="preserve">0f3d3c7</w:t>
+      </w:r>
+      <w:r>
+        <w:t xml:space="preserve">) não aparecem como commits próprios na branch.</w:t>
       </w:r>
     </w:p>
     <w:p>
@@ -4061,7 +4234,7 @@
               <w:rPr>
                 <w:rStyle w:val="VerbatimChar"/>
               </w:rPr>
-              <w:t xml:space="preserve">git fetch &amp;&amp; git log --oneline origin/producao</w:t>
+              <w:t xml:space="preserve">git fetch &amp;&amp; git log --first-parent --oneline origin/producao</w:t>
             </w:r>
             <w:r>
               <w:t xml:space="preserve"> </w:t>
@@ -4094,6 +4267,22 @@
                 <w:bCs/>
               </w:rPr>
               <w:t xml:space="preserve">production</w:t>
+            </w:r>
+            <w:r>
+              <w:t xml:space="preserve"> </w:t>
+            </w:r>
+            <w:r>
+              <w:t xml:space="preserve">· Argo CD →</w:t>
+            </w:r>
+            <w:r>
+              <w:t xml:space="preserve"> </w:t>
+            </w:r>
+            <w:r>
+              <w:rPr>
+                <w:i/>
+                <w:iCs/>
+              </w:rPr>
+              <w:t xml:space="preserve">History and rollback</w:t>
             </w:r>
           </w:p>
         </w:tc>
@@ -4374,7 +4563,35 @@
               <w:t xml:space="preserve">Re-run all jobs</w:t>
             </w:r>
             <w:r>
-              <w:t xml:space="preserve">. Ele grava de volta a tag daquele commit (pedindo aprovação de novo) e o Argo aplica.</w:t>
+              <w:t xml:space="preserve">. Ele grava um</w:t>
+            </w:r>
+            <w:r>
+              <w:t xml:space="preserve"> </w:t>
+            </w:r>
+            <w:r>
+              <w:rPr>
+                <w:b/>
+                <w:bCs/>
+              </w:rPr>
+              <w:t xml:space="preserve">novo</w:t>
+            </w:r>
+            <w:r>
+              <w:t xml:space="preserve"> </w:t>
+            </w:r>
+            <w:r>
+              <w:t xml:space="preserve">commit de deploy com a tag daquele commit (pedindo aprovação de novo) e o Argo aplica — o rollback fica registrado no histórico da</w:t>
+            </w:r>
+            <w:r>
+              <w:t xml:space="preserve"> </w:t>
+            </w:r>
+            <w:r>
+              <w:rPr>
+                <w:rStyle w:val="VerbatimChar"/>
+              </w:rPr>
+              <w:t xml:space="preserve">producao</w:t>
+            </w:r>
+            <w:r>
+              <w:t xml:space="preserve">.</w:t>
             </w:r>
           </w:p>
         </w:tc>
@@ -4793,7 +5010,7 @@
         <w:t xml:space="preserve">Produção só muda por esteira + aprovação</w:t>
       </w:r>
       <w:r>
-        <w:t xml:space="preserve">, independentemente de quantos devs existam. Dois deploys seguidos? O último gravado na</w:t>
+        <w:t xml:space="preserve">, independentemente de quantos devs existam. Dois deploys seguidos? Entram em fila; o último gravado na</w:t>
       </w:r>
       <w:r>
         <w:t xml:space="preserve"> </w:t>
@@ -4808,7 +5025,22 @@
         <w:t xml:space="preserve"> </w:t>
       </w:r>
       <w:r>
-        <w:t xml:space="preserve">é o que vale, e o histórico mostra os dois.</w:t>
+        <w:t xml:space="preserve">é o que vale, e</w:t>
+      </w:r>
+      <w:r>
+        <w:t xml:space="preserve"> </w:t>
+      </w:r>
+      <w:r>
+        <w:rPr>
+          <w:rStyle w:val="VerbatimChar"/>
+        </w:rPr>
+        <w:t xml:space="preserve">git log --first-parent origin/producao</w:t>
+      </w:r>
+      <w:r>
+        <w:t xml:space="preserve"> </w:t>
+      </w:r>
+      <w:r>
+        <w:t xml:space="preserve">mostra os dois.</w:t>
       </w:r>
     </w:p>
     <w:p>

</xml_diff>